<commit_message>
Update Spanish ReinaValera1909 alignments and regenerate all formats for 2026-06-15
</commit_message>
<xml_diff>
--- a/spa/docx/08.content.docx
+++ b/spa/docx/08.content.docx
@@ -45,19 +45,7 @@
         <w:rPr>
           <w:lang w:val="es_ES" w:bidi="es_ES"/>
         </w:rPr>
-        <w:t xml:space="preserve"> (Spanish) is based on: </w:t>
-      </w:r>
-      <w:r>
-        <w:rPr>
-          <w:lang w:val="es_ES" w:bidi="es_ES"/>
-        </w:rPr>
-        <w:t>Reina Valera 1909</w:t>
-      </w:r>
-      <w:r>
-        <w:rPr>
-          <w:lang w:val="es_ES" w:bidi="es_ES"/>
-        </w:rPr>
-        <w:t xml:space="preserve">, </w:t>
+        <w:t xml:space="preserve"> © 1909 </w:t>
       </w:r>
       <w:hyperlink r:id="rId13">
         <w:r>
@@ -75,9 +63,9 @@
         <w:rPr>
           <w:lang w:val="es_ES" w:bidi="es_ES"/>
         </w:rPr>
-        <w:t xml:space="preserve">, None, which is licensed under a </w:t>
-      </w:r>
-      <w:hyperlink r:id="rId14">
+        <w:t xml:space="preserve">, licensed under a </w:t>
+      </w:r>
+      <w:hyperlink r:id="rId13">
         <w:r>
           <w:rPr>
             <w:lang w:val="es_ES" w:bidi="es_ES"/>
@@ -94,25 +82,6 @@
           <w:lang w:val="es_ES" w:bidi="es_ES"/>
         </w:rPr>
         <w:t>.</w:t>
-      </w:r>
-      <w:r>
-        <w:rPr>
-          <w:lang w:val="es_ES" w:bidi="es_ES"/>
-        </w:rPr>
-      </w:r>
-    </w:p>
-    <w:p>
-      <w:pPr/>
-      <w:r>
-        <w:rPr>
-          <w:lang w:val="es_ES" w:bidi="es_ES"/>
-        </w:rPr>
-      </w:r>
-      <w:r>
-        <w:rPr>
-          <w:lang w:val="es_ES" w:bidi="es_ES"/>
-        </w:rPr>
-        <w:t>This PDF version is provided under the same license.</w:t>
       </w:r>
       <w:r>
         <w:rPr>
@@ -212,14 +181,6 @@
       </w:pPr>
     </w:p>
     <w:p>
-      <w:pPr/>
-      <w:r>
-        <w:rPr>
-          <w:lang w:val="es_ES" w:bidi="es_ES"/>
-        </w:rPr>
-      </w:r>
-    </w:p>
-    <w:p>
       <w:pPr>
         <w:pStyle w:val="Heading2"/>
       </w:pPr>
@@ -227,7 +188,7 @@
         <w:rPr>
           <w:lang w:val="es_ES" w:bidi="es_ES"/>
         </w:rPr>
-        <w:t>Ruth 1:1</w:t>
+        <w:t>Rut 1:1</w:t>
       </w:r>
       <w:r>
         <w:rPr>
@@ -255,24 +216,6 @@
         </w:rPr>
         <w:t xml:space="preserve"> Y ACONTECIÓ en los días que gobernaban los jueces, que hubo hambre en la tierra. Y un varón de Beth-lehem de Judá, fué á peregrinar en los campos de Moab, él y su mujer, y dos hijos suyos.</w:t>
       </w:r>
-      <w:r>
-        <w:rPr>
-          <w:lang w:val="es_ES" w:bidi="es_ES"/>
-        </w:rPr>
-      </w:r>
-      <w:r>
-        <w:rPr>
-          <w:lang w:val="es_ES" w:bidi="es_ES"/>
-        </w:rPr>
-      </w:r>
-    </w:p>
-    <w:p>
-      <w:pPr/>
-      <w:r>
-        <w:rPr>
-          <w:lang w:val="es_ES" w:bidi="es_ES"/>
-        </w:rPr>
-      </w:r>
     </w:p>
     <w:p>
       <w:pPr/>
@@ -294,24 +237,6 @@
         </w:rPr>
         <w:t xml:space="preserve"> El nombre de aquel varón era Elimelech, y el de su mujer Noemi; y los nombres de sus dos hijos eran, Mahalón y Chelión, Ephrateos de Beth-lehem de Judá. Llegaron pues á los campos de Moab, y asentaron allí.</w:t>
       </w:r>
-      <w:r>
-        <w:rPr>
-          <w:lang w:val="es_ES" w:bidi="es_ES"/>
-        </w:rPr>
-      </w:r>
-      <w:r>
-        <w:rPr>
-          <w:lang w:val="es_ES" w:bidi="es_ES"/>
-        </w:rPr>
-      </w:r>
-    </w:p>
-    <w:p>
-      <w:pPr/>
-      <w:r>
-        <w:rPr>
-          <w:lang w:val="es_ES" w:bidi="es_ES"/>
-        </w:rPr>
-      </w:r>
     </w:p>
     <w:p>
       <w:pPr/>
@@ -333,24 +258,6 @@
         </w:rPr>
         <w:t xml:space="preserve"> Y murió Elimelech, marido de Noemi, y quedó ella con sus dos hijos;</w:t>
       </w:r>
-      <w:r>
-        <w:rPr>
-          <w:lang w:val="es_ES" w:bidi="es_ES"/>
-        </w:rPr>
-      </w:r>
-      <w:r>
-        <w:rPr>
-          <w:lang w:val="es_ES" w:bidi="es_ES"/>
-        </w:rPr>
-      </w:r>
-    </w:p>
-    <w:p>
-      <w:pPr/>
-      <w:r>
-        <w:rPr>
-          <w:lang w:val="es_ES" w:bidi="es_ES"/>
-        </w:rPr>
-      </w:r>
     </w:p>
     <w:p>
       <w:pPr/>
@@ -372,24 +279,6 @@
         </w:rPr>
         <w:t xml:space="preserve"> Los cuales tomaron para sí mujeres de Moab, el nombre de la una Orpha, y el nombre de la otra Ruth; y habitaron allí unos diez años.</w:t>
       </w:r>
-      <w:r>
-        <w:rPr>
-          <w:lang w:val="es_ES" w:bidi="es_ES"/>
-        </w:rPr>
-      </w:r>
-      <w:r>
-        <w:rPr>
-          <w:lang w:val="es_ES" w:bidi="es_ES"/>
-        </w:rPr>
-      </w:r>
-    </w:p>
-    <w:p>
-      <w:pPr/>
-      <w:r>
-        <w:rPr>
-          <w:lang w:val="es_ES" w:bidi="es_ES"/>
-        </w:rPr>
-      </w:r>
     </w:p>
     <w:p>
       <w:pPr/>
@@ -411,24 +300,6 @@
         </w:rPr>
         <w:t xml:space="preserve"> Y murieron también los dos, Mahalón y Chelión, quedando así la mujer desamparada de sus dos hijos y de su marido.</w:t>
       </w:r>
-      <w:r>
-        <w:rPr>
-          <w:lang w:val="es_ES" w:bidi="es_ES"/>
-        </w:rPr>
-      </w:r>
-      <w:r>
-        <w:rPr>
-          <w:lang w:val="es_ES" w:bidi="es_ES"/>
-        </w:rPr>
-      </w:r>
-    </w:p>
-    <w:p>
-      <w:pPr/>
-      <w:r>
-        <w:rPr>
-          <w:lang w:val="es_ES" w:bidi="es_ES"/>
-        </w:rPr>
-      </w:r>
     </w:p>
     <w:p>
       <w:pPr/>
@@ -450,24 +321,6 @@
         </w:rPr>
         <w:t xml:space="preserve"> Entonces se levantó con sus nueras, y volvióse de los campos de Moab: porque oyó en el campo de Moab que Jehová había visitado á su pueblo para darles pan.</w:t>
       </w:r>
-      <w:r>
-        <w:rPr>
-          <w:lang w:val="es_ES" w:bidi="es_ES"/>
-        </w:rPr>
-      </w:r>
-      <w:r>
-        <w:rPr>
-          <w:lang w:val="es_ES" w:bidi="es_ES"/>
-        </w:rPr>
-      </w:r>
-    </w:p>
-    <w:p>
-      <w:pPr/>
-      <w:r>
-        <w:rPr>
-          <w:lang w:val="es_ES" w:bidi="es_ES"/>
-        </w:rPr>
-      </w:r>
     </w:p>
     <w:p>
       <w:pPr/>
@@ -489,24 +342,6 @@
         </w:rPr>
         <w:t xml:space="preserve"> Salió pues del lugar donde había estado, y con ella sus dos nueras, y comenzaron á caminar para volverse á la tierra de Judá.</w:t>
       </w:r>
-      <w:r>
-        <w:rPr>
-          <w:lang w:val="es_ES" w:bidi="es_ES"/>
-        </w:rPr>
-      </w:r>
-      <w:r>
-        <w:rPr>
-          <w:lang w:val="es_ES" w:bidi="es_ES"/>
-        </w:rPr>
-      </w:r>
-    </w:p>
-    <w:p>
-      <w:pPr/>
-      <w:r>
-        <w:rPr>
-          <w:lang w:val="es_ES" w:bidi="es_ES"/>
-        </w:rPr>
-      </w:r>
     </w:p>
     <w:p>
       <w:pPr/>
@@ -528,24 +363,6 @@
         </w:rPr>
         <w:t xml:space="preserve"> Y Noemi dijo á sus dos nueras: Andad, volveos cada una á la casa de su madre: Jehová haga con vosotras misericordia, como la habéis hecho con los muertos y conmigo.</w:t>
       </w:r>
-      <w:r>
-        <w:rPr>
-          <w:lang w:val="es_ES" w:bidi="es_ES"/>
-        </w:rPr>
-      </w:r>
-      <w:r>
-        <w:rPr>
-          <w:lang w:val="es_ES" w:bidi="es_ES"/>
-        </w:rPr>
-      </w:r>
-    </w:p>
-    <w:p>
-      <w:pPr/>
-      <w:r>
-        <w:rPr>
-          <w:lang w:val="es_ES" w:bidi="es_ES"/>
-        </w:rPr>
-      </w:r>
     </w:p>
     <w:p>
       <w:pPr/>
@@ -567,24 +384,6 @@
         </w:rPr>
         <w:t xml:space="preserve"> Déos Jehová que halléis descanso, cada una en casa de su marido: besólas luego, y ellas lloraron á voz en grito.</w:t>
       </w:r>
-      <w:r>
-        <w:rPr>
-          <w:lang w:val="es_ES" w:bidi="es_ES"/>
-        </w:rPr>
-      </w:r>
-      <w:r>
-        <w:rPr>
-          <w:lang w:val="es_ES" w:bidi="es_ES"/>
-        </w:rPr>
-      </w:r>
-    </w:p>
-    <w:p>
-      <w:pPr/>
-      <w:r>
-        <w:rPr>
-          <w:lang w:val="es_ES" w:bidi="es_ES"/>
-        </w:rPr>
-      </w:r>
     </w:p>
     <w:p>
       <w:pPr/>
@@ -606,24 +405,6 @@
         </w:rPr>
         <w:t xml:space="preserve"> Y dijéronle: Ciertamente nosotras volveremos contigo á tu pueblo.</w:t>
       </w:r>
-      <w:r>
-        <w:rPr>
-          <w:lang w:val="es_ES" w:bidi="es_ES"/>
-        </w:rPr>
-      </w:r>
-      <w:r>
-        <w:rPr>
-          <w:lang w:val="es_ES" w:bidi="es_ES"/>
-        </w:rPr>
-      </w:r>
-    </w:p>
-    <w:p>
-      <w:pPr/>
-      <w:r>
-        <w:rPr>
-          <w:lang w:val="es_ES" w:bidi="es_ES"/>
-        </w:rPr>
-      </w:r>
     </w:p>
     <w:p>
       <w:pPr/>
@@ -645,24 +426,6 @@
         </w:rPr>
         <w:t xml:space="preserve"> Y Noemi respondió: Volveos, hijas mías: ¿para qué habéis de ir conmigo? ¿tengo yo más hijos en el vientre, que puedan ser vuestros maridos?</w:t>
       </w:r>
-      <w:r>
-        <w:rPr>
-          <w:lang w:val="es_ES" w:bidi="es_ES"/>
-        </w:rPr>
-      </w:r>
-      <w:r>
-        <w:rPr>
-          <w:lang w:val="es_ES" w:bidi="es_ES"/>
-        </w:rPr>
-      </w:r>
-    </w:p>
-    <w:p>
-      <w:pPr/>
-      <w:r>
-        <w:rPr>
-          <w:lang w:val="es_ES" w:bidi="es_ES"/>
-        </w:rPr>
-      </w:r>
     </w:p>
     <w:p>
       <w:pPr/>
@@ -684,24 +447,6 @@
         </w:rPr>
         <w:t xml:space="preserve"> Volveos, hijas mías, é idos; que yo ya soy vieja para ser para varón. Y aunque dijese: Esperanza tengo; y esta noche fuese con varón, y aun pariese hijos;</w:t>
       </w:r>
-      <w:r>
-        <w:rPr>
-          <w:lang w:val="es_ES" w:bidi="es_ES"/>
-        </w:rPr>
-      </w:r>
-      <w:r>
-        <w:rPr>
-          <w:lang w:val="es_ES" w:bidi="es_ES"/>
-        </w:rPr>
-      </w:r>
-    </w:p>
-    <w:p>
-      <w:pPr/>
-      <w:r>
-        <w:rPr>
-          <w:lang w:val="es_ES" w:bidi="es_ES"/>
-        </w:rPr>
-      </w:r>
     </w:p>
     <w:p>
       <w:pPr/>
@@ -723,24 +468,6 @@
         </w:rPr>
         <w:t xml:space="preserve"> ¿Habíais vosotras de esperarlos hasta que fuesen grandes? ¿habías vosotras de quedaros sin casar por amor de ellos? No, hijas mías; que mayor amargura tengo yo que vosotras, pues la mano de Jehová ha salido contra mí.</w:t>
       </w:r>
-      <w:r>
-        <w:rPr>
-          <w:lang w:val="es_ES" w:bidi="es_ES"/>
-        </w:rPr>
-      </w:r>
-      <w:r>
-        <w:rPr>
-          <w:lang w:val="es_ES" w:bidi="es_ES"/>
-        </w:rPr>
-      </w:r>
-    </w:p>
-    <w:p>
-      <w:pPr/>
-      <w:r>
-        <w:rPr>
-          <w:lang w:val="es_ES" w:bidi="es_ES"/>
-        </w:rPr>
-      </w:r>
     </w:p>
     <w:p>
       <w:pPr/>
@@ -762,24 +489,6 @@
         </w:rPr>
         <w:t xml:space="preserve"> Mas ellas alzando otra vez su voz, lloraron: y Orpha besó á su suegra, mas Ruth se quedó con ella.</w:t>
       </w:r>
-      <w:r>
-        <w:rPr>
-          <w:lang w:val="es_ES" w:bidi="es_ES"/>
-        </w:rPr>
-      </w:r>
-      <w:r>
-        <w:rPr>
-          <w:lang w:val="es_ES" w:bidi="es_ES"/>
-        </w:rPr>
-      </w:r>
-    </w:p>
-    <w:p>
-      <w:pPr/>
-      <w:r>
-        <w:rPr>
-          <w:lang w:val="es_ES" w:bidi="es_ES"/>
-        </w:rPr>
-      </w:r>
     </w:p>
     <w:p>
       <w:pPr/>
@@ -801,24 +510,6 @@
         </w:rPr>
         <w:t xml:space="preserve"> Y Noemi dijo: He aquí tu cuñada se ha vuelto á su pueblo y á sus dioses; vuélvete tú tras ella.</w:t>
       </w:r>
-      <w:r>
-        <w:rPr>
-          <w:lang w:val="es_ES" w:bidi="es_ES"/>
-        </w:rPr>
-      </w:r>
-      <w:r>
-        <w:rPr>
-          <w:lang w:val="es_ES" w:bidi="es_ES"/>
-        </w:rPr>
-      </w:r>
-    </w:p>
-    <w:p>
-      <w:pPr/>
-      <w:r>
-        <w:rPr>
-          <w:lang w:val="es_ES" w:bidi="es_ES"/>
-        </w:rPr>
-      </w:r>
     </w:p>
     <w:p>
       <w:pPr/>
@@ -840,24 +531,6 @@
         </w:rPr>
         <w:t xml:space="preserve"> Y Ruth respondió: No me ruegues que te deje, y me aparte de ti: porque donde quiera que tú fueres, iré yo; y donde quiera que vivieres, viviré. Tu pueblo será mi pueblo, y tu Dios mi Dios.</w:t>
       </w:r>
-      <w:r>
-        <w:rPr>
-          <w:lang w:val="es_ES" w:bidi="es_ES"/>
-        </w:rPr>
-      </w:r>
-      <w:r>
-        <w:rPr>
-          <w:lang w:val="es_ES" w:bidi="es_ES"/>
-        </w:rPr>
-      </w:r>
-    </w:p>
-    <w:p>
-      <w:pPr/>
-      <w:r>
-        <w:rPr>
-          <w:lang w:val="es_ES" w:bidi="es_ES"/>
-        </w:rPr>
-      </w:r>
     </w:p>
     <w:p>
       <w:pPr/>
@@ -879,24 +552,6 @@
         </w:rPr>
         <w:t xml:space="preserve"> Donde tú murieres, moriré yo, y allí seré sepultada: así me haga Jehová, y así me dé, que sólo la muerte hará separación entre mí y ti.</w:t>
       </w:r>
-      <w:r>
-        <w:rPr>
-          <w:lang w:val="es_ES" w:bidi="es_ES"/>
-        </w:rPr>
-      </w:r>
-      <w:r>
-        <w:rPr>
-          <w:lang w:val="es_ES" w:bidi="es_ES"/>
-        </w:rPr>
-      </w:r>
-    </w:p>
-    <w:p>
-      <w:pPr/>
-      <w:r>
-        <w:rPr>
-          <w:lang w:val="es_ES" w:bidi="es_ES"/>
-        </w:rPr>
-      </w:r>
     </w:p>
     <w:p>
       <w:pPr/>
@@ -918,24 +573,6 @@
         </w:rPr>
         <w:t xml:space="preserve"> Y viendo Noemi que estaba tan resuelta á ir con ella, dejó de hablarle.</w:t>
       </w:r>
-      <w:r>
-        <w:rPr>
-          <w:lang w:val="es_ES" w:bidi="es_ES"/>
-        </w:rPr>
-      </w:r>
-      <w:r>
-        <w:rPr>
-          <w:lang w:val="es_ES" w:bidi="es_ES"/>
-        </w:rPr>
-      </w:r>
-    </w:p>
-    <w:p>
-      <w:pPr/>
-      <w:r>
-        <w:rPr>
-          <w:lang w:val="es_ES" w:bidi="es_ES"/>
-        </w:rPr>
-      </w:r>
     </w:p>
     <w:p>
       <w:pPr/>
@@ -957,24 +594,6 @@
         </w:rPr>
         <w:t xml:space="preserve"> Anduvieron pues ellas dos hasta que llegaron á Beth-lehem: y aconteció que entrando en Beth-lehem, toda la ciudad se conmovió por razón de ellas, y decían: ¿No es ésta Noemi?</w:t>
       </w:r>
-      <w:r>
-        <w:rPr>
-          <w:lang w:val="es_ES" w:bidi="es_ES"/>
-        </w:rPr>
-      </w:r>
-      <w:r>
-        <w:rPr>
-          <w:lang w:val="es_ES" w:bidi="es_ES"/>
-        </w:rPr>
-      </w:r>
-    </w:p>
-    <w:p>
-      <w:pPr/>
-      <w:r>
-        <w:rPr>
-          <w:lang w:val="es_ES" w:bidi="es_ES"/>
-        </w:rPr>
-      </w:r>
     </w:p>
     <w:p>
       <w:pPr/>
@@ -996,24 +615,6 @@
         </w:rPr>
         <w:t xml:space="preserve"> Y ella les respondía: No me llaméis Noemi, sino llamadme Mara: porque en grande amargura me ha puesto el Todopoderoso.</w:t>
       </w:r>
-      <w:r>
-        <w:rPr>
-          <w:lang w:val="es_ES" w:bidi="es_ES"/>
-        </w:rPr>
-      </w:r>
-      <w:r>
-        <w:rPr>
-          <w:lang w:val="es_ES" w:bidi="es_ES"/>
-        </w:rPr>
-      </w:r>
-    </w:p>
-    <w:p>
-      <w:pPr/>
-      <w:r>
-        <w:rPr>
-          <w:lang w:val="es_ES" w:bidi="es_ES"/>
-        </w:rPr>
-      </w:r>
     </w:p>
     <w:p>
       <w:pPr/>
@@ -1035,24 +636,6 @@
         </w:rPr>
         <w:t xml:space="preserve"> Yo me fuí llena, mas vacía me ha vuelto Jehová. ¿Por qué me llamaréis Noemi, ya que Jehová ha dado testimonio contra mí, y el Todopoderoso me ha afligido?</w:t>
       </w:r>
-      <w:r>
-        <w:rPr>
-          <w:lang w:val="es_ES" w:bidi="es_ES"/>
-        </w:rPr>
-      </w:r>
-      <w:r>
-        <w:rPr>
-          <w:lang w:val="es_ES" w:bidi="es_ES"/>
-        </w:rPr>
-      </w:r>
-    </w:p>
-    <w:p>
-      <w:pPr/>
-      <w:r>
-        <w:rPr>
-          <w:lang w:val="es_ES" w:bidi="es_ES"/>
-        </w:rPr>
-      </w:r>
     </w:p>
     <w:p>
       <w:pPr/>
@@ -1074,24 +657,6 @@
         </w:rPr>
         <w:t xml:space="preserve"> Así volvió Noemi y Ruth Moabita su nuera con ella; volvió de los campos de Moab, y llegaron á Beth-lehem en el principio de la siega de las cebadas.</w:t>
       </w:r>
-      <w:r>
-        <w:rPr>
-          <w:lang w:val="es_ES" w:bidi="es_ES"/>
-        </w:rPr>
-      </w:r>
-      <w:r>
-        <w:rPr>
-          <w:lang w:val="es_ES" w:bidi="es_ES"/>
-        </w:rPr>
-      </w:r>
-    </w:p>
-    <w:p>
-      <w:pPr/>
-      <w:r>
-        <w:rPr>
-          <w:lang w:val="es_ES" w:bidi="es_ES"/>
-        </w:rPr>
-      </w:r>
     </w:p>
     <w:p>
       <w:pPr>
@@ -1101,7 +666,7 @@
         <w:rPr>
           <w:lang w:val="es_ES" w:bidi="es_ES"/>
         </w:rPr>
-        <w:t>Ruth 2:1</w:t>
+        <w:t>Rut 2:1</w:t>
       </w:r>
       <w:r>
         <w:rPr>
@@ -1129,24 +694,6 @@
         </w:rPr>
         <w:t xml:space="preserve"> Y TENÍA Noemi un pariente de su marido, varón poderoso y de hecho, de la familia de Elimelech, el cual se llamaba Booz.</w:t>
       </w:r>
-      <w:r>
-        <w:rPr>
-          <w:lang w:val="es_ES" w:bidi="es_ES"/>
-        </w:rPr>
-      </w:r>
-      <w:r>
-        <w:rPr>
-          <w:lang w:val="es_ES" w:bidi="es_ES"/>
-        </w:rPr>
-      </w:r>
-    </w:p>
-    <w:p>
-      <w:pPr/>
-      <w:r>
-        <w:rPr>
-          <w:lang w:val="es_ES" w:bidi="es_ES"/>
-        </w:rPr>
-      </w:r>
     </w:p>
     <w:p>
       <w:pPr/>
@@ -1168,24 +715,6 @@
         </w:rPr>
         <w:t xml:space="preserve"> Y Ruth la Moabita dijo á Noemi: Ruégote que me dejes ir al campo, y cogeré espigas en pos de aquel á cuyos ojos hallare gracia. Y ella le respondió: Ve, hija mía.</w:t>
       </w:r>
-      <w:r>
-        <w:rPr>
-          <w:lang w:val="es_ES" w:bidi="es_ES"/>
-        </w:rPr>
-      </w:r>
-      <w:r>
-        <w:rPr>
-          <w:lang w:val="es_ES" w:bidi="es_ES"/>
-        </w:rPr>
-      </w:r>
-    </w:p>
-    <w:p>
-      <w:pPr/>
-      <w:r>
-        <w:rPr>
-          <w:lang w:val="es_ES" w:bidi="es_ES"/>
-        </w:rPr>
-      </w:r>
     </w:p>
     <w:p>
       <w:pPr/>
@@ -1207,24 +736,6 @@
         </w:rPr>
         <w:t xml:space="preserve"> Fué pues, y llegando, espigó en el campo en pos de los segadores: y aconteció por ventura, que la suerte del campo era de Booz, el cual era de la parentela de Elimelech.</w:t>
       </w:r>
-      <w:r>
-        <w:rPr>
-          <w:lang w:val="es_ES" w:bidi="es_ES"/>
-        </w:rPr>
-      </w:r>
-      <w:r>
-        <w:rPr>
-          <w:lang w:val="es_ES" w:bidi="es_ES"/>
-        </w:rPr>
-      </w:r>
-    </w:p>
-    <w:p>
-      <w:pPr/>
-      <w:r>
-        <w:rPr>
-          <w:lang w:val="es_ES" w:bidi="es_ES"/>
-        </w:rPr>
-      </w:r>
     </w:p>
     <w:p>
       <w:pPr/>
@@ -1246,24 +757,6 @@
         </w:rPr>
         <w:t xml:space="preserve"> Y he aquí que Booz vino de Beth-lehem, y dijo á los segadores: Jehová sea con vosotros. Y ellos respondieron: Jehová te bendiga.</w:t>
       </w:r>
-      <w:r>
-        <w:rPr>
-          <w:lang w:val="es_ES" w:bidi="es_ES"/>
-        </w:rPr>
-      </w:r>
-      <w:r>
-        <w:rPr>
-          <w:lang w:val="es_ES" w:bidi="es_ES"/>
-        </w:rPr>
-      </w:r>
-    </w:p>
-    <w:p>
-      <w:pPr/>
-      <w:r>
-        <w:rPr>
-          <w:lang w:val="es_ES" w:bidi="es_ES"/>
-        </w:rPr>
-      </w:r>
     </w:p>
     <w:p>
       <w:pPr/>
@@ -1285,24 +778,6 @@
         </w:rPr>
         <w:t xml:space="preserve"> Y Booz dijo á su criado el sobrestante de los segadores: ¿Cúya es esta moza?</w:t>
       </w:r>
-      <w:r>
-        <w:rPr>
-          <w:lang w:val="es_ES" w:bidi="es_ES"/>
-        </w:rPr>
-      </w:r>
-      <w:r>
-        <w:rPr>
-          <w:lang w:val="es_ES" w:bidi="es_ES"/>
-        </w:rPr>
-      </w:r>
-    </w:p>
-    <w:p>
-      <w:pPr/>
-      <w:r>
-        <w:rPr>
-          <w:lang w:val="es_ES" w:bidi="es_ES"/>
-        </w:rPr>
-      </w:r>
     </w:p>
     <w:p>
       <w:pPr/>
@@ -1324,24 +799,6 @@
         </w:rPr>
         <w:t xml:space="preserve"> Y el criado, sobrestante de los segadores, respondió y dijo: Es la moza de Moab, que volvió con Noemi de los campos de Moab;</w:t>
       </w:r>
-      <w:r>
-        <w:rPr>
-          <w:lang w:val="es_ES" w:bidi="es_ES"/>
-        </w:rPr>
-      </w:r>
-      <w:r>
-        <w:rPr>
-          <w:lang w:val="es_ES" w:bidi="es_ES"/>
-        </w:rPr>
-      </w:r>
-    </w:p>
-    <w:p>
-      <w:pPr/>
-      <w:r>
-        <w:rPr>
-          <w:lang w:val="es_ES" w:bidi="es_ES"/>
-        </w:rPr>
-      </w:r>
     </w:p>
     <w:p>
       <w:pPr/>
@@ -1363,24 +820,6 @@
         </w:rPr>
         <w:t xml:space="preserve"> Y ha dicho: Ruégote que me dejes coger y juntar tras los segadores entre las gavillas: entró pues, y está desde por la mañana hasta ahora, menos un poco que se detuvo en casa.</w:t>
       </w:r>
-      <w:r>
-        <w:rPr>
-          <w:lang w:val="es_ES" w:bidi="es_ES"/>
-        </w:rPr>
-      </w:r>
-      <w:r>
-        <w:rPr>
-          <w:lang w:val="es_ES" w:bidi="es_ES"/>
-        </w:rPr>
-      </w:r>
-    </w:p>
-    <w:p>
-      <w:pPr/>
-      <w:r>
-        <w:rPr>
-          <w:lang w:val="es_ES" w:bidi="es_ES"/>
-        </w:rPr>
-      </w:r>
     </w:p>
     <w:p>
       <w:pPr/>
@@ -1402,24 +841,6 @@
         </w:rPr>
         <w:t xml:space="preserve"> Entonces Booz dijo á Ruth: Oye, hija mía, no vayas á espigar á otro campo, ni pases de aquí: y aquí estarás con mis mozas.</w:t>
       </w:r>
-      <w:r>
-        <w:rPr>
-          <w:lang w:val="es_ES" w:bidi="es_ES"/>
-        </w:rPr>
-      </w:r>
-      <w:r>
-        <w:rPr>
-          <w:lang w:val="es_ES" w:bidi="es_ES"/>
-        </w:rPr>
-      </w:r>
-    </w:p>
-    <w:p>
-      <w:pPr/>
-      <w:r>
-        <w:rPr>
-          <w:lang w:val="es_ES" w:bidi="es_ES"/>
-        </w:rPr>
-      </w:r>
     </w:p>
     <w:p>
       <w:pPr/>
@@ -1441,24 +862,6 @@
         </w:rPr>
         <w:t xml:space="preserve"> Mira bien al campo que segaren, y síguelas: porque yo he mandado á los mozos que no te toquen. Y si tuvieres sed, ve á los vasos, y bebe del agua que sacaren los mozos.</w:t>
       </w:r>
-      <w:r>
-        <w:rPr>
-          <w:lang w:val="es_ES" w:bidi="es_ES"/>
-        </w:rPr>
-      </w:r>
-      <w:r>
-        <w:rPr>
-          <w:lang w:val="es_ES" w:bidi="es_ES"/>
-        </w:rPr>
-      </w:r>
-    </w:p>
-    <w:p>
-      <w:pPr/>
-      <w:r>
-        <w:rPr>
-          <w:lang w:val="es_ES" w:bidi="es_ES"/>
-        </w:rPr>
-      </w:r>
     </w:p>
     <w:p>
       <w:pPr/>
@@ -1480,24 +883,6 @@
         </w:rPr>
         <w:t xml:space="preserve"> Ella entonces bajando su rostro inclinóse á tierra, y díjole: ¿Por qué he hallado gracia en tus ojos para que tú me reconozcas, siendo yo extranjera?</w:t>
       </w:r>
-      <w:r>
-        <w:rPr>
-          <w:lang w:val="es_ES" w:bidi="es_ES"/>
-        </w:rPr>
-      </w:r>
-      <w:r>
-        <w:rPr>
-          <w:lang w:val="es_ES" w:bidi="es_ES"/>
-        </w:rPr>
-      </w:r>
-    </w:p>
-    <w:p>
-      <w:pPr/>
-      <w:r>
-        <w:rPr>
-          <w:lang w:val="es_ES" w:bidi="es_ES"/>
-        </w:rPr>
-      </w:r>
     </w:p>
     <w:p>
       <w:pPr/>
@@ -1519,24 +904,6 @@
         </w:rPr>
         <w:t xml:space="preserve"> Y respondiendo Booz, díjole: Por cierto se me ha declarado todo lo que has hecho con tu suegra después de la muerte de tu marido, y que dejando á tu padre y á tu madre y la tierra donde naciste, has venido á pueblo que no conociste antes.</w:t>
       </w:r>
-      <w:r>
-        <w:rPr>
-          <w:lang w:val="es_ES" w:bidi="es_ES"/>
-        </w:rPr>
-      </w:r>
-      <w:r>
-        <w:rPr>
-          <w:lang w:val="es_ES" w:bidi="es_ES"/>
-        </w:rPr>
-      </w:r>
-    </w:p>
-    <w:p>
-      <w:pPr/>
-      <w:r>
-        <w:rPr>
-          <w:lang w:val="es_ES" w:bidi="es_ES"/>
-        </w:rPr>
-      </w:r>
     </w:p>
     <w:p>
       <w:pPr/>
@@ -1558,24 +925,6 @@
         </w:rPr>
         <w:t xml:space="preserve"> Jehová galardone tu obra, y tu remuneración sea llena por Jehová Dios de Israel, que has venido para cubrirte debajo de sus alas.</w:t>
       </w:r>
-      <w:r>
-        <w:rPr>
-          <w:lang w:val="es_ES" w:bidi="es_ES"/>
-        </w:rPr>
-      </w:r>
-      <w:r>
-        <w:rPr>
-          <w:lang w:val="es_ES" w:bidi="es_ES"/>
-        </w:rPr>
-      </w:r>
-    </w:p>
-    <w:p>
-      <w:pPr/>
-      <w:r>
-        <w:rPr>
-          <w:lang w:val="es_ES" w:bidi="es_ES"/>
-        </w:rPr>
-      </w:r>
     </w:p>
     <w:p>
       <w:pPr/>
@@ -1597,24 +946,6 @@
         </w:rPr>
         <w:t xml:space="preserve"> Y ella dijo: Señor mío, halle yo gracia delante de tus ojos; porque me has consolado, y porque has hablado al corazón de tu sierva, no siendo yo como una de tus criadas.</w:t>
       </w:r>
-      <w:r>
-        <w:rPr>
-          <w:lang w:val="es_ES" w:bidi="es_ES"/>
-        </w:rPr>
-      </w:r>
-      <w:r>
-        <w:rPr>
-          <w:lang w:val="es_ES" w:bidi="es_ES"/>
-        </w:rPr>
-      </w:r>
-    </w:p>
-    <w:p>
-      <w:pPr/>
-      <w:r>
-        <w:rPr>
-          <w:lang w:val="es_ES" w:bidi="es_ES"/>
-        </w:rPr>
-      </w:r>
     </w:p>
     <w:p>
       <w:pPr/>
@@ -1636,24 +967,6 @@
         </w:rPr>
         <w:t xml:space="preserve"> Y Booz le dijo á la hora de comer: Allégate aquí, y come del pan, y moja tu bocado en el vinagre. Y sentóse ella junto á los segadores, y él le dió del potaje, y comió hasta que se hartó y le sobró.</w:t>
       </w:r>
-      <w:r>
-        <w:rPr>
-          <w:lang w:val="es_ES" w:bidi="es_ES"/>
-        </w:rPr>
-      </w:r>
-      <w:r>
-        <w:rPr>
-          <w:lang w:val="es_ES" w:bidi="es_ES"/>
-        </w:rPr>
-      </w:r>
-    </w:p>
-    <w:p>
-      <w:pPr/>
-      <w:r>
-        <w:rPr>
-          <w:lang w:val="es_ES" w:bidi="es_ES"/>
-        </w:rPr>
-      </w:r>
     </w:p>
     <w:p>
       <w:pPr/>
@@ -1675,24 +988,6 @@
         </w:rPr>
         <w:t xml:space="preserve"> Levantóse luego para espigar. Y Booz mandó á sus criados, diciendo: Coja también espigas entre las gavillas, y no la avergoncéis;</w:t>
       </w:r>
-      <w:r>
-        <w:rPr>
-          <w:lang w:val="es_ES" w:bidi="es_ES"/>
-        </w:rPr>
-      </w:r>
-      <w:r>
-        <w:rPr>
-          <w:lang w:val="es_ES" w:bidi="es_ES"/>
-        </w:rPr>
-      </w:r>
-    </w:p>
-    <w:p>
-      <w:pPr/>
-      <w:r>
-        <w:rPr>
-          <w:lang w:val="es_ES" w:bidi="es_ES"/>
-        </w:rPr>
-      </w:r>
     </w:p>
     <w:p>
       <w:pPr/>
@@ -1714,24 +1009,6 @@
         </w:rPr>
         <w:t xml:space="preserve"> Antes echaréis á sabiendas de los manojos, y la dejaréis que coja, y no la reprendáis.</w:t>
       </w:r>
-      <w:r>
-        <w:rPr>
-          <w:lang w:val="es_ES" w:bidi="es_ES"/>
-        </w:rPr>
-      </w:r>
-      <w:r>
-        <w:rPr>
-          <w:lang w:val="es_ES" w:bidi="es_ES"/>
-        </w:rPr>
-      </w:r>
-    </w:p>
-    <w:p>
-      <w:pPr/>
-      <w:r>
-        <w:rPr>
-          <w:lang w:val="es_ES" w:bidi="es_ES"/>
-        </w:rPr>
-      </w:r>
     </w:p>
     <w:p>
       <w:pPr/>
@@ -1753,24 +1030,6 @@
         </w:rPr>
         <w:t xml:space="preserve"> Y espigó en el campo hasta la tarde, y desgranó lo que había cogido, y fué como un epha de cebada.</w:t>
       </w:r>
-      <w:r>
-        <w:rPr>
-          <w:lang w:val="es_ES" w:bidi="es_ES"/>
-        </w:rPr>
-      </w:r>
-      <w:r>
-        <w:rPr>
-          <w:lang w:val="es_ES" w:bidi="es_ES"/>
-        </w:rPr>
-      </w:r>
-    </w:p>
-    <w:p>
-      <w:pPr/>
-      <w:r>
-        <w:rPr>
-          <w:lang w:val="es_ES" w:bidi="es_ES"/>
-        </w:rPr>
-      </w:r>
     </w:p>
     <w:p>
       <w:pPr/>
@@ -1792,24 +1051,6 @@
         </w:rPr>
         <w:t xml:space="preserve"> Y tomólo, y vínose á la ciudad; y su suegra vió lo que había cogido. Sacó también luego lo que le había sobrado después de harta, y dióselo.</w:t>
       </w:r>
-      <w:r>
-        <w:rPr>
-          <w:lang w:val="es_ES" w:bidi="es_ES"/>
-        </w:rPr>
-      </w:r>
-      <w:r>
-        <w:rPr>
-          <w:lang w:val="es_ES" w:bidi="es_ES"/>
-        </w:rPr>
-      </w:r>
-    </w:p>
-    <w:p>
-      <w:pPr/>
-      <w:r>
-        <w:rPr>
-          <w:lang w:val="es_ES" w:bidi="es_ES"/>
-        </w:rPr>
-      </w:r>
     </w:p>
     <w:p>
       <w:pPr/>
@@ -1831,24 +1072,6 @@
         </w:rPr>
         <w:t xml:space="preserve"> Y díjole su suegra: ¿Dónde has espigado hoy? ¿y dónde has trabajado? bendito sea el que te ha reconocido. Y ella declaró á su suegra lo que le había acontecido con aquél, y dijo: El nombre del varón con quien hoy he trabajado es Booz.</w:t>
       </w:r>
-      <w:r>
-        <w:rPr>
-          <w:lang w:val="es_ES" w:bidi="es_ES"/>
-        </w:rPr>
-      </w:r>
-      <w:r>
-        <w:rPr>
-          <w:lang w:val="es_ES" w:bidi="es_ES"/>
-        </w:rPr>
-      </w:r>
-    </w:p>
-    <w:p>
-      <w:pPr/>
-      <w:r>
-        <w:rPr>
-          <w:lang w:val="es_ES" w:bidi="es_ES"/>
-        </w:rPr>
-      </w:r>
     </w:p>
     <w:p>
       <w:pPr/>
@@ -1870,24 +1093,6 @@
         </w:rPr>
         <w:t xml:space="preserve"> Y dijo Noemi á su nuera: Sea él bendito de Jehová, pues que no ha rehusado á los vivos la benevolencia que tuvo para con los finados. Díjole después Noemi: Nuestro pariente es aquel varón, y de nuestros redentores es.</w:t>
       </w:r>
-      <w:r>
-        <w:rPr>
-          <w:lang w:val="es_ES" w:bidi="es_ES"/>
-        </w:rPr>
-      </w:r>
-      <w:r>
-        <w:rPr>
-          <w:lang w:val="es_ES" w:bidi="es_ES"/>
-        </w:rPr>
-      </w:r>
-    </w:p>
-    <w:p>
-      <w:pPr/>
-      <w:r>
-        <w:rPr>
-          <w:lang w:val="es_ES" w:bidi="es_ES"/>
-        </w:rPr>
-      </w:r>
     </w:p>
     <w:p>
       <w:pPr/>
@@ -1909,24 +1114,6 @@
         </w:rPr>
         <w:t xml:space="preserve"> Y Ruth Moabita dijo: A más de esto me ha dicho: Júntate con mis criados, hasta que hayan acabado toda mi siega.</w:t>
       </w:r>
-      <w:r>
-        <w:rPr>
-          <w:lang w:val="es_ES" w:bidi="es_ES"/>
-        </w:rPr>
-      </w:r>
-      <w:r>
-        <w:rPr>
-          <w:lang w:val="es_ES" w:bidi="es_ES"/>
-        </w:rPr>
-      </w:r>
-    </w:p>
-    <w:p>
-      <w:pPr/>
-      <w:r>
-        <w:rPr>
-          <w:lang w:val="es_ES" w:bidi="es_ES"/>
-        </w:rPr>
-      </w:r>
     </w:p>
     <w:p>
       <w:pPr/>
@@ -1948,24 +1135,6 @@
         </w:rPr>
         <w:t xml:space="preserve"> Y Noemi respondió á Ruth su nuera: Mejor es, hija mía, que salgas con sus criadas, que no que te encuentren en otro campo.</w:t>
       </w:r>
-      <w:r>
-        <w:rPr>
-          <w:lang w:val="es_ES" w:bidi="es_ES"/>
-        </w:rPr>
-      </w:r>
-      <w:r>
-        <w:rPr>
-          <w:lang w:val="es_ES" w:bidi="es_ES"/>
-        </w:rPr>
-      </w:r>
-    </w:p>
-    <w:p>
-      <w:pPr/>
-      <w:r>
-        <w:rPr>
-          <w:lang w:val="es_ES" w:bidi="es_ES"/>
-        </w:rPr>
-      </w:r>
     </w:p>
     <w:p>
       <w:pPr/>
@@ -1987,24 +1156,6 @@
         </w:rPr>
         <w:t xml:space="preserve"> Estuvo pues junta con las mozas de Booz espigando, hasta que la siega de las cebadas y la de los trigos fué acabada; mas con su suegra habitó.</w:t>
       </w:r>
-      <w:r>
-        <w:rPr>
-          <w:lang w:val="es_ES" w:bidi="es_ES"/>
-        </w:rPr>
-      </w:r>
-      <w:r>
-        <w:rPr>
-          <w:lang w:val="es_ES" w:bidi="es_ES"/>
-        </w:rPr>
-      </w:r>
-    </w:p>
-    <w:p>
-      <w:pPr/>
-      <w:r>
-        <w:rPr>
-          <w:lang w:val="es_ES" w:bidi="es_ES"/>
-        </w:rPr>
-      </w:r>
     </w:p>
     <w:p>
       <w:pPr>
@@ -2014,7 +1165,7 @@
         <w:rPr>
           <w:lang w:val="es_ES" w:bidi="es_ES"/>
         </w:rPr>
-        <w:t>Ruth 3:1</w:t>
+        <w:t>Rut 3:1</w:t>
       </w:r>
       <w:r>
         <w:rPr>
@@ -2042,24 +1193,6 @@
         </w:rPr>
         <w:t xml:space="preserve"> Y DÍJOLE su suegra Noemi: Hija mía, ¿no te tengo de buscar descanso, que te sea bueno?</w:t>
       </w:r>
-      <w:r>
-        <w:rPr>
-          <w:lang w:val="es_ES" w:bidi="es_ES"/>
-        </w:rPr>
-      </w:r>
-      <w:r>
-        <w:rPr>
-          <w:lang w:val="es_ES" w:bidi="es_ES"/>
-        </w:rPr>
-      </w:r>
-    </w:p>
-    <w:p>
-      <w:pPr/>
-      <w:r>
-        <w:rPr>
-          <w:lang w:val="es_ES" w:bidi="es_ES"/>
-        </w:rPr>
-      </w:r>
     </w:p>
     <w:p>
       <w:pPr/>
@@ -2081,24 +1214,6 @@
         </w:rPr>
         <w:t xml:space="preserve"> ¿No es Booz nuestro pariente, con cuyas mozas tú has estado? He aquí que él avienta esta noche la parva de las cebadas.</w:t>
       </w:r>
-      <w:r>
-        <w:rPr>
-          <w:lang w:val="es_ES" w:bidi="es_ES"/>
-        </w:rPr>
-      </w:r>
-      <w:r>
-        <w:rPr>
-          <w:lang w:val="es_ES" w:bidi="es_ES"/>
-        </w:rPr>
-      </w:r>
-    </w:p>
-    <w:p>
-      <w:pPr/>
-      <w:r>
-        <w:rPr>
-          <w:lang w:val="es_ES" w:bidi="es_ES"/>
-        </w:rPr>
-      </w:r>
     </w:p>
     <w:p>
       <w:pPr/>
@@ -2120,24 +1235,6 @@
         </w:rPr>
         <w:t xml:space="preserve"> Te lavarás pues, y te ungirás, y vistiéndote tus vestidos, pasarás á la era; mas no te darás á conocer al varón hasta que él haya acabado de comer y de beber.</w:t>
       </w:r>
-      <w:r>
-        <w:rPr>
-          <w:lang w:val="es_ES" w:bidi="es_ES"/>
-        </w:rPr>
-      </w:r>
-      <w:r>
-        <w:rPr>
-          <w:lang w:val="es_ES" w:bidi="es_ES"/>
-        </w:rPr>
-      </w:r>
-    </w:p>
-    <w:p>
-      <w:pPr/>
-      <w:r>
-        <w:rPr>
-          <w:lang w:val="es_ES" w:bidi="es_ES"/>
-        </w:rPr>
-      </w:r>
     </w:p>
     <w:p>
       <w:pPr/>
@@ -2159,24 +1256,6 @@
         </w:rPr>
         <w:t xml:space="preserve"> Y cuando él se acostare, repara tú el lugar donde él se acostará, é irás, y descubrirás los pies, y te acostarás allí; y él te dirá lo que hayas de hacer.</w:t>
       </w:r>
-      <w:r>
-        <w:rPr>
-          <w:lang w:val="es_ES" w:bidi="es_ES"/>
-        </w:rPr>
-      </w:r>
-      <w:r>
-        <w:rPr>
-          <w:lang w:val="es_ES" w:bidi="es_ES"/>
-        </w:rPr>
-      </w:r>
-    </w:p>
-    <w:p>
-      <w:pPr/>
-      <w:r>
-        <w:rPr>
-          <w:lang w:val="es_ES" w:bidi="es_ES"/>
-        </w:rPr>
-      </w:r>
     </w:p>
     <w:p>
       <w:pPr/>
@@ -2198,24 +1277,6 @@
         </w:rPr>
         <w:t xml:space="preserve"> Y le respondió: Haré todo lo que tú me mandares.</w:t>
       </w:r>
-      <w:r>
-        <w:rPr>
-          <w:lang w:val="es_ES" w:bidi="es_ES"/>
-        </w:rPr>
-      </w:r>
-      <w:r>
-        <w:rPr>
-          <w:lang w:val="es_ES" w:bidi="es_ES"/>
-        </w:rPr>
-      </w:r>
-    </w:p>
-    <w:p>
-      <w:pPr/>
-      <w:r>
-        <w:rPr>
-          <w:lang w:val="es_ES" w:bidi="es_ES"/>
-        </w:rPr>
-      </w:r>
     </w:p>
     <w:p>
       <w:pPr/>
@@ -2237,24 +1298,6 @@
         </w:rPr>
         <w:t xml:space="preserve"> Descendió pues á la era, é hizo todo lo que su suegra le había mandado.</w:t>
       </w:r>
-      <w:r>
-        <w:rPr>
-          <w:lang w:val="es_ES" w:bidi="es_ES"/>
-        </w:rPr>
-      </w:r>
-      <w:r>
-        <w:rPr>
-          <w:lang w:val="es_ES" w:bidi="es_ES"/>
-        </w:rPr>
-      </w:r>
-    </w:p>
-    <w:p>
-      <w:pPr/>
-      <w:r>
-        <w:rPr>
-          <w:lang w:val="es_ES" w:bidi="es_ES"/>
-        </w:rPr>
-      </w:r>
     </w:p>
     <w:p>
       <w:pPr/>
@@ -2276,24 +1319,6 @@
         </w:rPr>
         <w:t xml:space="preserve"> Y como Booz hubo comido y bebido, y su corazón estuvo contento, retiróse á dormir á un lado del montón. Entonces ella vino calladamente, y descubrió los pies, y acostóse.</w:t>
       </w:r>
-      <w:r>
-        <w:rPr>
-          <w:lang w:val="es_ES" w:bidi="es_ES"/>
-        </w:rPr>
-      </w:r>
-      <w:r>
-        <w:rPr>
-          <w:lang w:val="es_ES" w:bidi="es_ES"/>
-        </w:rPr>
-      </w:r>
-    </w:p>
-    <w:p>
-      <w:pPr/>
-      <w:r>
-        <w:rPr>
-          <w:lang w:val="es_ES" w:bidi="es_ES"/>
-        </w:rPr>
-      </w:r>
     </w:p>
     <w:p>
       <w:pPr/>
@@ -2315,24 +1340,6 @@
         </w:rPr>
         <w:t xml:space="preserve"> Y aconteció, que á la media noche se estremeció aquel hombre, y palpó: y he aquí, la mujer que estaba acostada á sus pies.</w:t>
       </w:r>
-      <w:r>
-        <w:rPr>
-          <w:lang w:val="es_ES" w:bidi="es_ES"/>
-        </w:rPr>
-      </w:r>
-      <w:r>
-        <w:rPr>
-          <w:lang w:val="es_ES" w:bidi="es_ES"/>
-        </w:rPr>
-      </w:r>
-    </w:p>
-    <w:p>
-      <w:pPr/>
-      <w:r>
-        <w:rPr>
-          <w:lang w:val="es_ES" w:bidi="es_ES"/>
-        </w:rPr>
-      </w:r>
     </w:p>
     <w:p>
       <w:pPr/>
@@ -2354,24 +1361,6 @@
         </w:rPr>
         <w:t xml:space="preserve"> Entonces él dijo: ¿Quién eres? Y ella respondió: Yo soy Ruth tu sierva: extiende el borde de tu capa sobre tu sierva, por cuanto eres pariente cercano.</w:t>
       </w:r>
-      <w:r>
-        <w:rPr>
-          <w:lang w:val="es_ES" w:bidi="es_ES"/>
-        </w:rPr>
-      </w:r>
-      <w:r>
-        <w:rPr>
-          <w:lang w:val="es_ES" w:bidi="es_ES"/>
-        </w:rPr>
-      </w:r>
-    </w:p>
-    <w:p>
-      <w:pPr/>
-      <w:r>
-        <w:rPr>
-          <w:lang w:val="es_ES" w:bidi="es_ES"/>
-        </w:rPr>
-      </w:r>
     </w:p>
     <w:p>
       <w:pPr/>
@@ -2393,24 +1382,6 @@
         </w:rPr>
         <w:t xml:space="preserve"> Y él dijo: Bendita seas tú de Jehová, hija mía; que has hecho mejor tu postrera gracia que la primera, no yendo tras los mancebos, sean pobres ó ricos.</w:t>
       </w:r>
-      <w:r>
-        <w:rPr>
-          <w:lang w:val="es_ES" w:bidi="es_ES"/>
-        </w:rPr>
-      </w:r>
-      <w:r>
-        <w:rPr>
-          <w:lang w:val="es_ES" w:bidi="es_ES"/>
-        </w:rPr>
-      </w:r>
-    </w:p>
-    <w:p>
-      <w:pPr/>
-      <w:r>
-        <w:rPr>
-          <w:lang w:val="es_ES" w:bidi="es_ES"/>
-        </w:rPr>
-      </w:r>
     </w:p>
     <w:p>
       <w:pPr/>
@@ -2432,24 +1403,6 @@
         </w:rPr>
         <w:t xml:space="preserve"> Ahora pues, no temas, hija mía: yo haré contigo lo que tú dijeres, pues que toda la puerta de mi pueblo sabe que eres mujer virtuosa.</w:t>
       </w:r>
-      <w:r>
-        <w:rPr>
-          <w:lang w:val="es_ES" w:bidi="es_ES"/>
-        </w:rPr>
-      </w:r>
-      <w:r>
-        <w:rPr>
-          <w:lang w:val="es_ES" w:bidi="es_ES"/>
-        </w:rPr>
-      </w:r>
-    </w:p>
-    <w:p>
-      <w:pPr/>
-      <w:r>
-        <w:rPr>
-          <w:lang w:val="es_ES" w:bidi="es_ES"/>
-        </w:rPr>
-      </w:r>
     </w:p>
     <w:p>
       <w:pPr/>
@@ -2471,24 +1424,6 @@
         </w:rPr>
         <w:t xml:space="preserve"> Y ahora, aunque es cierto que yo soy pariente cercano, con todo eso hay pariente más cercano que yo.</w:t>
       </w:r>
-      <w:r>
-        <w:rPr>
-          <w:lang w:val="es_ES" w:bidi="es_ES"/>
-        </w:rPr>
-      </w:r>
-      <w:r>
-        <w:rPr>
-          <w:lang w:val="es_ES" w:bidi="es_ES"/>
-        </w:rPr>
-      </w:r>
-    </w:p>
-    <w:p>
-      <w:pPr/>
-      <w:r>
-        <w:rPr>
-          <w:lang w:val="es_ES" w:bidi="es_ES"/>
-        </w:rPr>
-      </w:r>
     </w:p>
     <w:p>
       <w:pPr/>
@@ -2510,24 +1445,6 @@
         </w:rPr>
         <w:t xml:space="preserve"> Reposa esta noche, y cuando sea de día, si él te redimiere, bien, redímate; mas si él no te quisiere redimir, yo te redimiré, vive Jehová. Descansa pues hasta la mañana.</w:t>
       </w:r>
-      <w:r>
-        <w:rPr>
-          <w:lang w:val="es_ES" w:bidi="es_ES"/>
-        </w:rPr>
-      </w:r>
-      <w:r>
-        <w:rPr>
-          <w:lang w:val="es_ES" w:bidi="es_ES"/>
-        </w:rPr>
-      </w:r>
-    </w:p>
-    <w:p>
-      <w:pPr/>
-      <w:r>
-        <w:rPr>
-          <w:lang w:val="es_ES" w:bidi="es_ES"/>
-        </w:rPr>
-      </w:r>
     </w:p>
     <w:p>
       <w:pPr/>
@@ -2549,24 +1466,6 @@
         </w:rPr>
         <w:t xml:space="preserve"> Y después que reposó á sus pies hasta la mañana, levantóse, antes que nadie pudiese conocer á otro. Y él dijo: No se sepa que haya venido mujer á la era.</w:t>
       </w:r>
-      <w:r>
-        <w:rPr>
-          <w:lang w:val="es_ES" w:bidi="es_ES"/>
-        </w:rPr>
-      </w:r>
-      <w:r>
-        <w:rPr>
-          <w:lang w:val="es_ES" w:bidi="es_ES"/>
-        </w:rPr>
-      </w:r>
-    </w:p>
-    <w:p>
-      <w:pPr/>
-      <w:r>
-        <w:rPr>
-          <w:lang w:val="es_ES" w:bidi="es_ES"/>
-        </w:rPr>
-      </w:r>
     </w:p>
     <w:p>
       <w:pPr/>
@@ -2588,24 +1487,6 @@
         </w:rPr>
         <w:t xml:space="preserve"> Después le dijo: Llega el lienzo que traes sobre ti, y ten de él. Y teniéndolo ella, él midió seis medidas de cebada, y púsoselas á cuestas: y vínose ella á la ciudad.</w:t>
       </w:r>
-      <w:r>
-        <w:rPr>
-          <w:lang w:val="es_ES" w:bidi="es_ES"/>
-        </w:rPr>
-      </w:r>
-      <w:r>
-        <w:rPr>
-          <w:lang w:val="es_ES" w:bidi="es_ES"/>
-        </w:rPr>
-      </w:r>
-    </w:p>
-    <w:p>
-      <w:pPr/>
-      <w:r>
-        <w:rPr>
-          <w:lang w:val="es_ES" w:bidi="es_ES"/>
-        </w:rPr>
-      </w:r>
     </w:p>
     <w:p>
       <w:pPr/>
@@ -2627,24 +1508,6 @@
         </w:rPr>
         <w:t xml:space="preserve"> Así que vino á su suegra, ésta le dijo: ¿Qué pues, hija mía? Y declaróle ella todo lo que con aquel varón le había acontecido.</w:t>
       </w:r>
-      <w:r>
-        <w:rPr>
-          <w:lang w:val="es_ES" w:bidi="es_ES"/>
-        </w:rPr>
-      </w:r>
-      <w:r>
-        <w:rPr>
-          <w:lang w:val="es_ES" w:bidi="es_ES"/>
-        </w:rPr>
-      </w:r>
-    </w:p>
-    <w:p>
-      <w:pPr/>
-      <w:r>
-        <w:rPr>
-          <w:lang w:val="es_ES" w:bidi="es_ES"/>
-        </w:rPr>
-      </w:r>
     </w:p>
     <w:p>
       <w:pPr/>
@@ -2666,24 +1529,6 @@
         </w:rPr>
         <w:t xml:space="preserve"> Y dijo: Estas seis medidas de cebada me dió, diciéndome: Porque no vayas vacía á tu suegra.</w:t>
       </w:r>
-      <w:r>
-        <w:rPr>
-          <w:lang w:val="es_ES" w:bidi="es_ES"/>
-        </w:rPr>
-      </w:r>
-      <w:r>
-        <w:rPr>
-          <w:lang w:val="es_ES" w:bidi="es_ES"/>
-        </w:rPr>
-      </w:r>
-    </w:p>
-    <w:p>
-      <w:pPr/>
-      <w:r>
-        <w:rPr>
-          <w:lang w:val="es_ES" w:bidi="es_ES"/>
-        </w:rPr>
-      </w:r>
     </w:p>
     <w:p>
       <w:pPr/>
@@ -2705,24 +1550,6 @@
         </w:rPr>
         <w:t xml:space="preserve"> Entonces Noemi dijo: Reposa, hija mía, hasta que sepas cómo cae la cosa: porque aquel hombre no parará hasta que hoy concluya el negocio.</w:t>
       </w:r>
-      <w:r>
-        <w:rPr>
-          <w:lang w:val="es_ES" w:bidi="es_ES"/>
-        </w:rPr>
-      </w:r>
-      <w:r>
-        <w:rPr>
-          <w:lang w:val="es_ES" w:bidi="es_ES"/>
-        </w:rPr>
-      </w:r>
-    </w:p>
-    <w:p>
-      <w:pPr/>
-      <w:r>
-        <w:rPr>
-          <w:lang w:val="es_ES" w:bidi="es_ES"/>
-        </w:rPr>
-      </w:r>
     </w:p>
     <w:p>
       <w:pPr>
@@ -2732,7 +1559,7 @@
         <w:rPr>
           <w:lang w:val="es_ES" w:bidi="es_ES"/>
         </w:rPr>
-        <w:t>Ruth 4:1</w:t>
+        <w:t>Rut 4:1</w:t>
       </w:r>
       <w:r>
         <w:rPr>
@@ -2760,24 +1587,6 @@
         </w:rPr>
         <w:t xml:space="preserve"> Y BOOZ subió á la puerta y sentóse allí: y he aquí pasaba aquel pariente del cual había Booz hablado, y díjole: Eh, fulano, ven acá y siéntate. Y él vino, y sentóse.</w:t>
       </w:r>
-      <w:r>
-        <w:rPr>
-          <w:lang w:val="es_ES" w:bidi="es_ES"/>
-        </w:rPr>
-      </w:r>
-      <w:r>
-        <w:rPr>
-          <w:lang w:val="es_ES" w:bidi="es_ES"/>
-        </w:rPr>
-      </w:r>
-    </w:p>
-    <w:p>
-      <w:pPr/>
-      <w:r>
-        <w:rPr>
-          <w:lang w:val="es_ES" w:bidi="es_ES"/>
-        </w:rPr>
-      </w:r>
     </w:p>
     <w:p>
       <w:pPr/>
@@ -2799,24 +1608,6 @@
         </w:rPr>
         <w:t xml:space="preserve"> Entonces él tomó diez varones de los ancianos de la ciudad, y dijo: Sentaos aquí. Y ellos se sentaron.</w:t>
       </w:r>
-      <w:r>
-        <w:rPr>
-          <w:lang w:val="es_ES" w:bidi="es_ES"/>
-        </w:rPr>
-      </w:r>
-      <w:r>
-        <w:rPr>
-          <w:lang w:val="es_ES" w:bidi="es_ES"/>
-        </w:rPr>
-      </w:r>
-    </w:p>
-    <w:p>
-      <w:pPr/>
-      <w:r>
-        <w:rPr>
-          <w:lang w:val="es_ES" w:bidi="es_ES"/>
-        </w:rPr>
-      </w:r>
     </w:p>
     <w:p>
       <w:pPr/>
@@ -2838,24 +1629,6 @@
         </w:rPr>
         <w:t xml:space="preserve"> Luego dijo al pariente: Noemi, que ha vuelto del campo de Moab, vende una parte de las tierras que tuvo nuestro hermano Elimelech;</w:t>
       </w:r>
-      <w:r>
-        <w:rPr>
-          <w:lang w:val="es_ES" w:bidi="es_ES"/>
-        </w:rPr>
-      </w:r>
-      <w:r>
-        <w:rPr>
-          <w:lang w:val="es_ES" w:bidi="es_ES"/>
-        </w:rPr>
-      </w:r>
-    </w:p>
-    <w:p>
-      <w:pPr/>
-      <w:r>
-        <w:rPr>
-          <w:lang w:val="es_ES" w:bidi="es_ES"/>
-        </w:rPr>
-      </w:r>
     </w:p>
     <w:p>
       <w:pPr/>
@@ -2877,24 +1650,6 @@
         </w:rPr>
         <w:t xml:space="preserve"> Y yo decidí hacértelo saber, y decirte que la tomes delante de los que están aquí sentados, y delante de los ancianos de mi pueblo. Si hubieres de redimir, redime; y si no quisieres redimir, decláramelo para que yo lo sepa: porque no hay otro que redima sino tú, y yo después de ti. Y él respondió: Yo redimiré.</w:t>
       </w:r>
-      <w:r>
-        <w:rPr>
-          <w:lang w:val="es_ES" w:bidi="es_ES"/>
-        </w:rPr>
-      </w:r>
-      <w:r>
-        <w:rPr>
-          <w:lang w:val="es_ES" w:bidi="es_ES"/>
-        </w:rPr>
-      </w:r>
-    </w:p>
-    <w:p>
-      <w:pPr/>
-      <w:r>
-        <w:rPr>
-          <w:lang w:val="es_ES" w:bidi="es_ES"/>
-        </w:rPr>
-      </w:r>
     </w:p>
     <w:p>
       <w:pPr/>
@@ -2916,24 +1671,6 @@
         </w:rPr>
         <w:t xml:space="preserve"> Entonces replicó Booz: El mismo día que tomares las tierras de mano de Noemi, has de tomar también á Ruth Moabita, mujer del difunto, para que suscites el nombre del muerto sobre su posesión.</w:t>
       </w:r>
-      <w:r>
-        <w:rPr>
-          <w:lang w:val="es_ES" w:bidi="es_ES"/>
-        </w:rPr>
-      </w:r>
-      <w:r>
-        <w:rPr>
-          <w:lang w:val="es_ES" w:bidi="es_ES"/>
-        </w:rPr>
-      </w:r>
-    </w:p>
-    <w:p>
-      <w:pPr/>
-      <w:r>
-        <w:rPr>
-          <w:lang w:val="es_ES" w:bidi="es_ES"/>
-        </w:rPr>
-      </w:r>
     </w:p>
     <w:p>
       <w:pPr/>
@@ -2955,24 +1692,6 @@
         </w:rPr>
         <w:t xml:space="preserve"> Y respondió el pariente: No puedo redimir por mi parte, porque echaría á perder mi heredad: redime tú usando de mi derecho, porque yo no podré redimir.</w:t>
       </w:r>
-      <w:r>
-        <w:rPr>
-          <w:lang w:val="es_ES" w:bidi="es_ES"/>
-        </w:rPr>
-      </w:r>
-      <w:r>
-        <w:rPr>
-          <w:lang w:val="es_ES" w:bidi="es_ES"/>
-        </w:rPr>
-      </w:r>
-    </w:p>
-    <w:p>
-      <w:pPr/>
-      <w:r>
-        <w:rPr>
-          <w:lang w:val="es_ES" w:bidi="es_ES"/>
-        </w:rPr>
-      </w:r>
     </w:p>
     <w:p>
       <w:pPr/>
@@ -2994,24 +1713,6 @@
         </w:rPr>
         <w:t xml:space="preserve"> Había ya de largo tiempo esta costumbre en Israel en la redención ó contrato, que para la confirmación de cualquier negocio, el uno se quitaba el zapato y lo daba á su compañero: y este era el testimonio en Israel.</w:t>
       </w:r>
-      <w:r>
-        <w:rPr>
-          <w:lang w:val="es_ES" w:bidi="es_ES"/>
-        </w:rPr>
-      </w:r>
-      <w:r>
-        <w:rPr>
-          <w:lang w:val="es_ES" w:bidi="es_ES"/>
-        </w:rPr>
-      </w:r>
-    </w:p>
-    <w:p>
-      <w:pPr/>
-      <w:r>
-        <w:rPr>
-          <w:lang w:val="es_ES" w:bidi="es_ES"/>
-        </w:rPr>
-      </w:r>
     </w:p>
     <w:p>
       <w:pPr/>
@@ -3033,24 +1734,6 @@
         </w:rPr>
         <w:t xml:space="preserve"> Entonces el pariente dijo á Booz: Tómalo tú. Y descalzó su zapato.</w:t>
       </w:r>
-      <w:r>
-        <w:rPr>
-          <w:lang w:val="es_ES" w:bidi="es_ES"/>
-        </w:rPr>
-      </w:r>
-      <w:r>
-        <w:rPr>
-          <w:lang w:val="es_ES" w:bidi="es_ES"/>
-        </w:rPr>
-      </w:r>
-    </w:p>
-    <w:p>
-      <w:pPr/>
-      <w:r>
-        <w:rPr>
-          <w:lang w:val="es_ES" w:bidi="es_ES"/>
-        </w:rPr>
-      </w:r>
     </w:p>
     <w:p>
       <w:pPr/>
@@ -3072,24 +1755,6 @@
         </w:rPr>
         <w:t xml:space="preserve"> Y Booz dijo á los ancianos y á todo el pueblo: Vosotros sois hoy testigos de que tomo todas las cosas que fueron de Elimelech, y todo lo que fué de Chelión y de Mahalón, de mano de Noemi;</w:t>
       </w:r>
-      <w:r>
-        <w:rPr>
-          <w:lang w:val="es_ES" w:bidi="es_ES"/>
-        </w:rPr>
-      </w:r>
-      <w:r>
-        <w:rPr>
-          <w:lang w:val="es_ES" w:bidi="es_ES"/>
-        </w:rPr>
-      </w:r>
-    </w:p>
-    <w:p>
-      <w:pPr/>
-      <w:r>
-        <w:rPr>
-          <w:lang w:val="es_ES" w:bidi="es_ES"/>
-        </w:rPr>
-      </w:r>
     </w:p>
     <w:p>
       <w:pPr/>
@@ -3111,24 +1776,6 @@
         </w:rPr>
         <w:t xml:space="preserve"> Y que también tomo por mi mujer á Ruth Moabita, mujer de Mahalón, para suscitar el nombre del difunto sobre su heredad, para que el nombre del muerto no se borre de entre sus hermanos y de la puerta de su lugar. Vosotros sois hoy testigos.</w:t>
       </w:r>
-      <w:r>
-        <w:rPr>
-          <w:lang w:val="es_ES" w:bidi="es_ES"/>
-        </w:rPr>
-      </w:r>
-      <w:r>
-        <w:rPr>
-          <w:lang w:val="es_ES" w:bidi="es_ES"/>
-        </w:rPr>
-      </w:r>
-    </w:p>
-    <w:p>
-      <w:pPr/>
-      <w:r>
-        <w:rPr>
-          <w:lang w:val="es_ES" w:bidi="es_ES"/>
-        </w:rPr>
-      </w:r>
     </w:p>
     <w:p>
       <w:pPr/>
@@ -3150,24 +1797,6 @@
         </w:rPr>
         <w:t xml:space="preserve"> Y dijeron todos los del pueblo que estaban á la puerta con los ancianos: Testigos somos. Jehová haga á la mujer que entra en tu casa como á Rachêl y á Lea, las cuales dos edificaron la casa de Israel; y tú seas ilustre en Ephrata, y tengas nombradía en Beth-lehem;</w:t>
       </w:r>
-      <w:r>
-        <w:rPr>
-          <w:lang w:val="es_ES" w:bidi="es_ES"/>
-        </w:rPr>
-      </w:r>
-      <w:r>
-        <w:rPr>
-          <w:lang w:val="es_ES" w:bidi="es_ES"/>
-        </w:rPr>
-      </w:r>
-    </w:p>
-    <w:p>
-      <w:pPr/>
-      <w:r>
-        <w:rPr>
-          <w:lang w:val="es_ES" w:bidi="es_ES"/>
-        </w:rPr>
-      </w:r>
     </w:p>
     <w:p>
       <w:pPr/>
@@ -3189,24 +1818,6 @@
         </w:rPr>
         <w:t xml:space="preserve"> Y de la simiente que Jehová te diere de aquesta moza, sea tu casa como la casa de Phares, al que parió Thamar á Judá.</w:t>
       </w:r>
-      <w:r>
-        <w:rPr>
-          <w:lang w:val="es_ES" w:bidi="es_ES"/>
-        </w:rPr>
-      </w:r>
-      <w:r>
-        <w:rPr>
-          <w:lang w:val="es_ES" w:bidi="es_ES"/>
-        </w:rPr>
-      </w:r>
-    </w:p>
-    <w:p>
-      <w:pPr/>
-      <w:r>
-        <w:rPr>
-          <w:lang w:val="es_ES" w:bidi="es_ES"/>
-        </w:rPr>
-      </w:r>
     </w:p>
     <w:p>
       <w:pPr/>
@@ -3228,24 +1839,6 @@
         </w:rPr>
         <w:t xml:space="preserve"> Booz pues tomó á Ruth, y ella fué su mujer; y luego que entró á ella, Jehová le dió que concibiese y pariese un hijo.</w:t>
       </w:r>
-      <w:r>
-        <w:rPr>
-          <w:lang w:val="es_ES" w:bidi="es_ES"/>
-        </w:rPr>
-      </w:r>
-      <w:r>
-        <w:rPr>
-          <w:lang w:val="es_ES" w:bidi="es_ES"/>
-        </w:rPr>
-      </w:r>
-    </w:p>
-    <w:p>
-      <w:pPr/>
-      <w:r>
-        <w:rPr>
-          <w:lang w:val="es_ES" w:bidi="es_ES"/>
-        </w:rPr>
-      </w:r>
     </w:p>
     <w:p>
       <w:pPr/>
@@ -3267,24 +1860,6 @@
         </w:rPr>
         <w:t xml:space="preserve"> Y las mujeres decían á Noemi: Loado sea Jehová, que hizo que no te faltase hoy pariente, cuyo nombre será nombrado en Israel.</w:t>
       </w:r>
-      <w:r>
-        <w:rPr>
-          <w:lang w:val="es_ES" w:bidi="es_ES"/>
-        </w:rPr>
-      </w:r>
-      <w:r>
-        <w:rPr>
-          <w:lang w:val="es_ES" w:bidi="es_ES"/>
-        </w:rPr>
-      </w:r>
-    </w:p>
-    <w:p>
-      <w:pPr/>
-      <w:r>
-        <w:rPr>
-          <w:lang w:val="es_ES" w:bidi="es_ES"/>
-        </w:rPr>
-      </w:r>
     </w:p>
     <w:p>
       <w:pPr/>
@@ -3306,24 +1881,6 @@
         </w:rPr>
         <w:t xml:space="preserve"> El cual será restaurador de tu alma, y el que sustentará tu vejez; pues que tu nuera, la cual te ama y te vale más que siete hijos, le ha parido.</w:t>
       </w:r>
-      <w:r>
-        <w:rPr>
-          <w:lang w:val="es_ES" w:bidi="es_ES"/>
-        </w:rPr>
-      </w:r>
-      <w:r>
-        <w:rPr>
-          <w:lang w:val="es_ES" w:bidi="es_ES"/>
-        </w:rPr>
-      </w:r>
-    </w:p>
-    <w:p>
-      <w:pPr/>
-      <w:r>
-        <w:rPr>
-          <w:lang w:val="es_ES" w:bidi="es_ES"/>
-        </w:rPr>
-      </w:r>
     </w:p>
     <w:p>
       <w:pPr/>
@@ -3345,24 +1902,6 @@
         </w:rPr>
         <w:t xml:space="preserve"> Y tomando Noemi el hijo, púsolo en su regazo, y fuéle su ama.</w:t>
       </w:r>
-      <w:r>
-        <w:rPr>
-          <w:lang w:val="es_ES" w:bidi="es_ES"/>
-        </w:rPr>
-      </w:r>
-      <w:r>
-        <w:rPr>
-          <w:lang w:val="es_ES" w:bidi="es_ES"/>
-        </w:rPr>
-      </w:r>
-    </w:p>
-    <w:p>
-      <w:pPr/>
-      <w:r>
-        <w:rPr>
-          <w:lang w:val="es_ES" w:bidi="es_ES"/>
-        </w:rPr>
-      </w:r>
     </w:p>
     <w:p>
       <w:pPr/>
@@ -3384,24 +1923,6 @@
         </w:rPr>
         <w:t xml:space="preserve"> Y las vecinas diciendo, A Noemi ha nacido un hijo, le pusieron nombre; y llamáronle Obed. Este es padre de Isaí, padre de David.</w:t>
       </w:r>
-      <w:r>
-        <w:rPr>
-          <w:lang w:val="es_ES" w:bidi="es_ES"/>
-        </w:rPr>
-      </w:r>
-      <w:r>
-        <w:rPr>
-          <w:lang w:val="es_ES" w:bidi="es_ES"/>
-        </w:rPr>
-      </w:r>
-    </w:p>
-    <w:p>
-      <w:pPr/>
-      <w:r>
-        <w:rPr>
-          <w:lang w:val="es_ES" w:bidi="es_ES"/>
-        </w:rPr>
-      </w:r>
     </w:p>
     <w:p>
       <w:pPr/>
@@ -3423,24 +1944,6 @@
         </w:rPr>
         <w:t xml:space="preserve"> Y estas son las generaciones de Phares: Phares engendró á Hesrón;</w:t>
       </w:r>
-      <w:r>
-        <w:rPr>
-          <w:lang w:val="es_ES" w:bidi="es_ES"/>
-        </w:rPr>
-      </w:r>
-      <w:r>
-        <w:rPr>
-          <w:lang w:val="es_ES" w:bidi="es_ES"/>
-        </w:rPr>
-      </w:r>
-    </w:p>
-    <w:p>
-      <w:pPr/>
-      <w:r>
-        <w:rPr>
-          <w:lang w:val="es_ES" w:bidi="es_ES"/>
-        </w:rPr>
-      </w:r>
     </w:p>
     <w:p>
       <w:pPr/>
@@ -3462,24 +1965,6 @@
         </w:rPr>
         <w:t xml:space="preserve"> Y Hesrón engendró á Ram, y Ram engendró á Aminadab;</w:t>
       </w:r>
-      <w:r>
-        <w:rPr>
-          <w:lang w:val="es_ES" w:bidi="es_ES"/>
-        </w:rPr>
-      </w:r>
-      <w:r>
-        <w:rPr>
-          <w:lang w:val="es_ES" w:bidi="es_ES"/>
-        </w:rPr>
-      </w:r>
-    </w:p>
-    <w:p>
-      <w:pPr/>
-      <w:r>
-        <w:rPr>
-          <w:lang w:val="es_ES" w:bidi="es_ES"/>
-        </w:rPr>
-      </w:r>
     </w:p>
     <w:p>
       <w:pPr/>
@@ -3501,24 +1986,6 @@
         </w:rPr>
         <w:t xml:space="preserve"> Y Aminadab engendró á Nahasón, y Nahasón engendró á Salmón;</w:t>
       </w:r>
-      <w:r>
-        <w:rPr>
-          <w:lang w:val="es_ES" w:bidi="es_ES"/>
-        </w:rPr>
-      </w:r>
-      <w:r>
-        <w:rPr>
-          <w:lang w:val="es_ES" w:bidi="es_ES"/>
-        </w:rPr>
-      </w:r>
-    </w:p>
-    <w:p>
-      <w:pPr/>
-      <w:r>
-        <w:rPr>
-          <w:lang w:val="es_ES" w:bidi="es_ES"/>
-        </w:rPr>
-      </w:r>
     </w:p>
     <w:p>
       <w:pPr/>
@@ -3540,24 +2007,6 @@
         </w:rPr>
         <w:t xml:space="preserve"> Y Salmón engendró á Booz, y Booz engendró á Obed;</w:t>
       </w:r>
-      <w:r>
-        <w:rPr>
-          <w:lang w:val="es_ES" w:bidi="es_ES"/>
-        </w:rPr>
-      </w:r>
-      <w:r>
-        <w:rPr>
-          <w:lang w:val="es_ES" w:bidi="es_ES"/>
-        </w:rPr>
-      </w:r>
-    </w:p>
-    <w:p>
-      <w:pPr/>
-      <w:r>
-        <w:rPr>
-          <w:lang w:val="es_ES" w:bidi="es_ES"/>
-        </w:rPr>
-      </w:r>
     </w:p>
     <w:p>
       <w:pPr/>
@@ -3578,16 +2027,6 @@
           <w:lang w:val="es_ES" w:bidi="es_ES"/>
         </w:rPr>
         <w:t xml:space="preserve"> Y Obed engendró á Isaí, é Isaí engendró á David.</w:t>
-      </w:r>
-      <w:r>
-        <w:rPr>
-          <w:lang w:val="es_ES" w:bidi="es_ES"/>
-        </w:rPr>
-      </w:r>
-      <w:r>
-        <w:rPr>
-          <w:lang w:val="es_ES" w:bidi="es_ES"/>
-        </w:rPr>
       </w:r>
     </w:p>
     <w:sectPr>

</xml_diff>